<commit_message>
docs: complete simplified 4-stage PRD with internal sub-block diagrams, docx deliverables, and interview defense cheatsheet
</commit_message>
<xml_diff>
--- a/README.docx
+++ b/README.docx
@@ -25,6 +25,825 @@
           <w:sz w:val="21"/>
         </w:rPr>
         <w:t>Welcome to your central tracking workspace for embedded systems, hardware protocols, device bring-up, and issue resolution at VVDN.</w:t>
+      </w:r>
+    </w:p>
+    <w:p>
+      <w:pPr>
+        <w:spacing w:before="80" w:after="80"/>
+        <w:pBdr>
+          <w:bottom w:val="single" w:sz="6" w:space="1" w:color="E2E8F0"/>
+        </w:pBdr>
+      </w:pPr>
+    </w:p>
+    <w:p>
+      <w:pPr>
+        <w:spacing w:before="240" w:after="120"/>
+      </w:pPr>
+      <w:r>
+        <w:rPr>
+          <w:b/>
+          <w:color w:val="184C78"/>
+          <w:sz w:val="28"/>
+        </w:rPr>
+        <w:t>⚡ Featured Project: Smart Programmable Power Supply (85–265V AC In, 5–20V / 3A DC Out)</w:t>
+      </w:r>
+    </w:p>
+    <w:p>
+      <w:pPr>
+        <w:spacing w:after="80"/>
+      </w:pPr>
+      <w:r>
+        <w:rPr>
+          <w:color w:val="282C34"/>
+          <w:sz w:val="21"/>
+        </w:rPr>
+        <w:t>An intelligent, digitally controlled bench and industrial power supply module engineered for precision DC regulation (</w:t>
+      </w:r>
+      <w:r>
+        <w:rPr>
+          <w:i/>
+          <w:color w:val="145AA0"/>
+          <w:sz w:val="21"/>
+        </w:rPr>
+        <w:t>5.0\,V \dots 20.0\,V</w:t>
+      </w:r>
+      <w:r>
+        <w:rPr>
+          <w:color w:val="282C34"/>
+          <w:sz w:val="21"/>
+        </w:rPr>
+        <w:t xml:space="preserve"> DC @ up to </w:t>
+      </w:r>
+      <w:r>
+        <w:rPr>
+          <w:i/>
+          <w:color w:val="145AA0"/>
+          <w:sz w:val="21"/>
+        </w:rPr>
+        <w:t>3.0\,A</w:t>
+      </w:r>
+      <w:r>
+        <w:rPr>
+          <w:color w:val="282C34"/>
+          <w:sz w:val="21"/>
+        </w:rPr>
+        <w:t xml:space="preserve">, </w:t>
+      </w:r>
+      <w:r>
+        <w:rPr>
+          <w:i/>
+          <w:color w:val="145AA0"/>
+          <w:sz w:val="21"/>
+        </w:rPr>
+        <w:t>60\,W</w:t>
+      </w:r>
+      <w:r>
+        <w:rPr>
+          <w:color w:val="282C34"/>
+          <w:sz w:val="21"/>
+        </w:rPr>
+        <w:t xml:space="preserve"> max continuous) from universal AC mains (</w:t>
+      </w:r>
+      <w:r>
+        <w:rPr>
+          <w:i/>
+          <w:color w:val="145AA0"/>
+          <w:sz w:val="21"/>
+        </w:rPr>
+        <w:t>85\,V \dots 265\,V</w:t>
+      </w:r>
+      <w:r>
+        <w:rPr>
+          <w:color w:val="282C34"/>
+          <w:sz w:val="21"/>
+        </w:rPr>
+        <w:t xml:space="preserve"> AC RMS, </w:t>
+      </w:r>
+      <w:r>
+        <w:rPr>
+          <w:i/>
+          <w:color w:val="145AA0"/>
+          <w:sz w:val="21"/>
+        </w:rPr>
+        <w:t>47--63\,Hz</w:t>
+      </w:r>
+      <w:r>
+        <w:rPr>
+          <w:color w:val="282C34"/>
+          <w:sz w:val="21"/>
+        </w:rPr>
+        <w:t>).</w:t>
+      </w:r>
+    </w:p>
+    <w:p>
+      <w:pPr>
+        <w:spacing w:before="160" w:after="80"/>
+      </w:pPr>
+      <w:r>
+        <w:rPr>
+          <w:b/>
+          <w:color w:val="4682B4"/>
+          <w:sz w:val="24"/>
+        </w:rPr>
+        <w:t>Simplified 4-Stage Power Conversion Block Diagram</w:t>
+      </w:r>
+    </w:p>
+    <w:p>
+      <w:pPr>
+        <w:spacing w:after="80"/>
+      </w:pPr>
+      <w:r>
+        <w:rPr>
+          <w:i/>
+          <w:color w:val="145AA0"/>
+          <w:sz w:val="21"/>
+        </w:rPr>
+      </w:r>
+      <w:r>
+        <w:rPr>
+          <w:color w:val="282C34"/>
+          <w:sz w:val="21"/>
+        </w:rPr>
+        <w:t>\text{Mains Supply } (85\text{--}265\,\text{V AC}) \longrightarrow \text{Rectifier } (+120\text{--}375\,\text{V DC}) \longrightarrow \text{Converter DC-DC (Flyback } +24\,\text{V}) \longrightarrow \text{Final Stage (Buck-Boost } 5\text{--}20\,\text{V}) \longrightarrow \text{Device (DUT)}</w:t>
+      </w:r>
+      <w:r>
+        <w:rPr>
+          <w:i/>
+          <w:color w:val="145AA0"/>
+          <w:sz w:val="21"/>
+        </w:rPr>
+      </w:r>
+    </w:p>
+    <w:p>
+      <w:pPr>
+        <w:spacing w:after="80"/>
+      </w:pPr>
+      <w:r>
+        <w:rPr>
+          <w:color w:val="282C34"/>
+          <w:sz w:val="21"/>
+        </w:rPr>
+        <w:t>&lt;p align="center"&gt;</w:t>
+      </w:r>
+    </w:p>
+    <w:p>
+      <w:pPr>
+        <w:spacing w:after="80"/>
+      </w:pPr>
+      <w:r>
+        <w:rPr>
+          <w:color w:val="282C34"/>
+          <w:sz w:val="21"/>
+        </w:rPr>
+        <w:t>&lt;img src="smart_programmable_power_supply/diagram_simple_power_flow.png" alt="Simplified 4-Stage Power Flow Block Diagram" width="100%"/&gt;</w:t>
+      </w:r>
+    </w:p>
+    <w:p>
+      <w:pPr>
+        <w:spacing w:after="80"/>
+      </w:pPr>
+      <w:r>
+        <w:rPr>
+          <w:color w:val="282C34"/>
+          <w:sz w:val="21"/>
+        </w:rPr>
+        <w:t>&lt;/p&gt;</w:t>
+      </w:r>
+    </w:p>
+    <w:tbl>
+      <w:tblPr>
+        <w:tblW w:type="auto" w:w="0"/>
+        <w:jc w:val="center"/>
+        <w:tblLook w:firstColumn="1" w:firstRow="1" w:lastColumn="0" w:lastRow="0" w:noHBand="0" w:noVBand="1" w:val="04A0"/>
+      </w:tblPr>
+      <w:tblGrid>
+        <w:gridCol w:w="9792"/>
+      </w:tblGrid>
+      <w:tr>
+        <w:tc>
+          <w:tcPr>
+            <w:tcW w:type="dxa" w:w="9792"/>
+            <w:shd w:fill="F5F6F8"/>
+            <w:tcMar>
+              <w:top w:w="80" w:type="dxa"/>
+              <w:bottom w:w="80" w:type="dxa"/>
+              <w:left w:w="140" w:type="dxa"/>
+              <w:right w:w="140" w:type="dxa"/>
+            </w:tcMar>
+            <w:tcBorders>
+              <w:left w:val="single" w:sz="18" w:space="0" w:color="CBD5E0"/>
+              <w:top w:val="none"/>
+              <w:right w:val="none"/>
+              <w:bottom w:val="none"/>
+            </w:tcBorders>
+          </w:tcPr>
+          <w:p>
+            <w:pPr>
+              <w:spacing w:line="240" w:lineRule="auto" w:after="0"/>
+            </w:pPr>
+            <w:r>
+              <w:rPr>
+                <w:rFonts w:ascii="Consolas" w:hAnsi="Consolas"/>
+                <w:color w:val="2D3748"/>
+                <w:sz w:val="18"/>
+              </w:rPr>
+              <w:t>flowchart LR</w:t>
+              <w:br/>
+              <w:t xml:space="preserve">    %% Domain Styles</w:t>
+              <w:br/>
+              <w:t xml:space="preserve">    classDef acStyle fill:#ECEFF1,stroke:#37474F,stroke-width:2px,color:#263238</w:t>
+              <w:br/>
+              <w:t xml:space="preserve">    classDef rectStyle fill:#FFF3E0,stroke:#E65100,stroke-width:2px,color:#BF360C</w:t>
+              <w:br/>
+              <w:t xml:space="preserve">    classDef isoStyle fill:#C8E6C9,stroke:#2E7D32,stroke-width:2px,color:#1B5E20</w:t>
+              <w:br/>
+              <w:t xml:space="preserve">    classDef bbStyle fill:#B2EBF2,stroke:#00838F,stroke-width:2px,color:#004D40</w:t>
+              <w:br/>
+              <w:t xml:space="preserve">    classDef dutStyle fill:#E1BEE7,stroke:#6A1B9A,stroke-width:2px,color:#4A148C</w:t>
+              <w:br/>
+              <w:br/>
+              <w:t xml:space="preserve">    subgraph HOT_DOMAIN ["PRIMARY HOT DOMAIN (High Voltage)"]</w:t>
+              <w:br/>
+              <w:t xml:space="preserve">        S1["1. MAINS SUPPLY&lt;br/&gt;• 85V - 265V AC RMS&lt;br/&gt;• 2A Fuse, 10Ω NTC, MOV&lt;br/&gt;• 2-Stage EMI Filter"]:::acStyle</w:t>
+              <w:br/>
+              <w:t xml:space="preserve">        S2["2. RECTIFIER &amp; BULK&lt;br/&gt;• GBU606 Bridge (600V, 6A)&lt;br/&gt;• 100µF / 450V Bulk Cap&lt;br/&gt;• +120V to +375V DC Bus"]:::rectStyle</w:t>
+              <w:br/>
+              <w:t xml:space="preserve">        S1 --&gt;|"Filtered AC"| S2</w:t>
+              <w:br/>
+              <w:t xml:space="preserve">    end</w:t>
+              <w:br/>
+              <w:br/>
+              <w:t xml:space="preserve">    subgraph COLD_DOMAIN ["SECONDARY COLD DOMAIN (Touch-Safe SELV)"]</w:t>
+              <w:br/>
+              <w:t xml:space="preserve">        S3["3. CONVERTER DC-DC&lt;br/&gt;• QR Flyback (TI UCC28740)&lt;br/&gt;• PQ26/20 Core (Lp = 220µH)&lt;br/&gt;• ⚡ 3000V RMS Safety Isolation&lt;br/&gt;• Sync Rectifier (BSC052N06NS)&lt;br/&gt;• +24.0V DC Intermediate Rail (72W)"]:::isoStyle</w:t>
+              <w:br/>
+              <w:t xml:space="preserve">        S4["4. FINAL STAGE&lt;br/&gt;• 4-Switch Buck-Boost (TI LM5176)&lt;br/&gt;• 4x 40V Low-Rds MOSFETs&lt;br/&gt;• Analog DAC Steering (10mV)&lt;br/&gt;• Fast &lt; 5µs CC Hardware Clamp&lt;br/&gt;• 5.0V - 20.0V DC / 3.0A (60W)"]:::bbStyle</w:t>
+              <w:br/>
+              <w:t xml:space="preserve">        S3 --&gt;|"+24.0V DC Rail"| S4</w:t>
+              <w:br/>
+              <w:t xml:space="preserve">    end</w:t>
+              <w:br/>
+              <w:br/>
+              <w:t xml:space="preserve">    subgraph LOAD_DOMAIN ["APPLICATION"]</w:t>
+              <w:br/>
+              <w:t xml:space="preserve">        S5["5. TARGET DEVICE (DUT)&lt;br/&gt;• 4mm Gold Binding Posts&lt;br/&gt;• Clean DC: Ripple &lt; 25mV pk-pk&lt;br/&gt;• Overload Protected"]:::dutStyle</w:t>
+              <w:br/>
+              <w:t xml:space="preserve">    end</w:t>
+              <w:br/>
+              <w:br/>
+              <w:t xml:space="preserve">    S2 ==&gt;|"⚡ 3000V Isolation Barrier"| S3</w:t>
+              <w:br/>
+              <w:t xml:space="preserve">    S4 --&gt;|"Regulated Output"| S5</w:t>
+            </w:r>
+          </w:p>
+        </w:tc>
+      </w:tr>
+    </w:tbl>
+    <w:p/>
+    <w:p>
+      <w:pPr>
+        <w:spacing w:before="160" w:after="80"/>
+      </w:pPr>
+      <w:r>
+        <w:rPr>
+          <w:b/>
+          <w:color w:val="4682B4"/>
+          <w:sz w:val="24"/>
+        </w:rPr>
+        <w:t>Internal Sub-Block Diagrams (The 4 Stages in Detail)</w:t>
+      </w:r>
+    </w:p>
+    <w:tbl>
+      <w:tblPr>
+        <w:tblW w:type="auto" w:w="0"/>
+        <w:jc w:val="center"/>
+        <w:tblLook w:firstColumn="1" w:firstRow="1" w:lastColumn="0" w:lastRow="0" w:noHBand="0" w:noVBand="1" w:val="04A0"/>
+        <w:tblBorders>
+          <w:top w:val="single" w:sz="4" w:space="0" w:color="D0D7DE"/>
+          <w:left w:val="none"/>
+          <w:bottom w:val="single" w:sz="8" w:space="0" w:color="D0D7DE"/>
+          <w:right w:val="none"/>
+          <w:insideH w:val="single" w:sz="4" w:space="0" w:color="D0D7DE"/>
+          <w:insideV w:val="none"/>
+        </w:tblBorders>
+      </w:tblPr>
+      <w:tblGrid>
+        <w:gridCol w:w="3264"/>
+        <w:gridCol w:w="3264"/>
+        <w:gridCol w:w="3264"/>
+      </w:tblGrid>
+      <w:tr>
+        <w:tc>
+          <w:tcPr>
+            <w:tcW w:type="dxa" w:w="3264"/>
+            <w:shd w:fill="204A6E"/>
+            <w:tcMar>
+              <w:top w:w="100" w:type="dxa"/>
+              <w:bottom w:w="100" w:type="dxa"/>
+              <w:left w:w="120" w:type="dxa"/>
+              <w:right w:w="120" w:type="dxa"/>
+            </w:tcMar>
+            <w:vAlign w:val="center"/>
+          </w:tcPr>
+          <w:p>
+            <w:pPr>
+              <w:spacing w:after="0"/>
+            </w:pPr>
+            <w:r>
+              <w:rPr>
+                <w:b/>
+                <w:color w:val="FFFFFF"/>
+                <w:sz w:val="19"/>
+              </w:rPr>
+              <w:t>Stage</w:t>
+            </w:r>
+          </w:p>
+        </w:tc>
+        <w:tc>
+          <w:tcPr>
+            <w:tcW w:type="dxa" w:w="3264"/>
+            <w:shd w:fill="204A6E"/>
+            <w:tcMar>
+              <w:top w:w="100" w:type="dxa"/>
+              <w:bottom w:w="100" w:type="dxa"/>
+              <w:left w:w="120" w:type="dxa"/>
+              <w:right w:w="120" w:type="dxa"/>
+            </w:tcMar>
+            <w:vAlign w:val="center"/>
+          </w:tcPr>
+          <w:p>
+            <w:pPr>
+              <w:spacing w:after="0"/>
+            </w:pPr>
+            <w:r>
+              <w:rPr>
+                <w:b/>
+                <w:color w:val="FFFFFF"/>
+                <w:sz w:val="19"/>
+              </w:rPr>
+              <w:t>Subsystem Architecture Diagram</w:t>
+            </w:r>
+          </w:p>
+        </w:tc>
+        <w:tc>
+          <w:tcPr>
+            <w:tcW w:type="dxa" w:w="3264"/>
+            <w:shd w:fill="204A6E"/>
+            <w:tcMar>
+              <w:top w:w="100" w:type="dxa"/>
+              <w:bottom w:w="100" w:type="dxa"/>
+              <w:left w:w="120" w:type="dxa"/>
+              <w:right w:w="120" w:type="dxa"/>
+            </w:tcMar>
+            <w:vAlign w:val="center"/>
+          </w:tcPr>
+          <w:p>
+            <w:pPr>
+              <w:spacing w:after="0"/>
+            </w:pPr>
+            <w:r>
+              <w:rPr>
+                <w:b/>
+                <w:color w:val="FFFFFF"/>
+                <w:sz w:val="19"/>
+              </w:rPr>
+              <w:t>Key Circuitry &amp; Hardware Specifications</w:t>
+            </w:r>
+          </w:p>
+        </w:tc>
+      </w:tr>
+      <w:tr>
+        <w:tc>
+          <w:tcPr>
+            <w:tcW w:type="dxa" w:w="3264"/>
+            <w:tcMar>
+              <w:top w:w="80" w:type="dxa"/>
+              <w:bottom w:w="80" w:type="dxa"/>
+              <w:left w:w="120" w:type="dxa"/>
+              <w:right w:w="120" w:type="dxa"/>
+            </w:tcMar>
+            <w:vAlign w:val="center"/>
+          </w:tcPr>
+          <w:p>
+            <w:pPr>
+              <w:spacing w:after="0"/>
+            </w:pPr>
+            <w:r>
+              <w:rPr>
+                <w:b/>
+                <w:color w:val="282C34"/>
+                <w:sz w:val="18"/>
+              </w:rPr>
+              <w:t>Stage 1: Mains Supply</w:t>
+            </w:r>
+          </w:p>
+        </w:tc>
+        <w:tc>
+          <w:tcPr>
+            <w:tcW w:type="dxa" w:w="3264"/>
+            <w:tcMar>
+              <w:top w:w="80" w:type="dxa"/>
+              <w:bottom w:w="80" w:type="dxa"/>
+              <w:left w:w="120" w:type="dxa"/>
+              <w:right w:w="120" w:type="dxa"/>
+            </w:tcMar>
+            <w:vAlign w:val="center"/>
+          </w:tcPr>
+          <w:p>
+            <w:pPr>
+              <w:spacing w:after="0"/>
+            </w:pPr>
+            <w:r>
+              <w:rPr>
+                <w:color w:val="282C34"/>
+                <w:sz w:val="18"/>
+              </w:rPr>
+              <w:t>&lt;img src="smart_programmable_power_supply/diagram_inside_stage1_mains.png" width="450"/&gt;</w:t>
+            </w:r>
+          </w:p>
+        </w:tc>
+        <w:tc>
+          <w:tcPr>
+            <w:tcW w:type="dxa" w:w="3264"/>
+            <w:tcMar>
+              <w:top w:w="80" w:type="dxa"/>
+              <w:bottom w:w="80" w:type="dxa"/>
+              <w:left w:w="120" w:type="dxa"/>
+              <w:right w:w="120" w:type="dxa"/>
+            </w:tcMar>
+            <w:vAlign w:val="center"/>
+          </w:tcPr>
+          <w:p>
+            <w:pPr>
+              <w:spacing w:after="0"/>
+            </w:pPr>
+            <w:r>
+              <w:rPr>
+                <w:color w:val="282C34"/>
+                <w:sz w:val="18"/>
+              </w:rPr>
+              <w:t>85V–265V AC In, 2A Fuse, 10Ω NTC, 14D471K MOV, 2-Stage CM Chokes (15mH, 4.7mH), X2/Y1 filter.</w:t>
+            </w:r>
+          </w:p>
+        </w:tc>
+      </w:tr>
+      <w:tr>
+        <w:tc>
+          <w:tcPr>
+            <w:tcW w:type="dxa" w:w="3264"/>
+            <w:shd w:fill="F4F7F9"/>
+            <w:tcMar>
+              <w:top w:w="80" w:type="dxa"/>
+              <w:bottom w:w="80" w:type="dxa"/>
+              <w:left w:w="120" w:type="dxa"/>
+              <w:right w:w="120" w:type="dxa"/>
+            </w:tcMar>
+            <w:vAlign w:val="center"/>
+          </w:tcPr>
+          <w:p>
+            <w:pPr>
+              <w:spacing w:after="0"/>
+            </w:pPr>
+            <w:r>
+              <w:rPr>
+                <w:b/>
+                <w:color w:val="282C34"/>
+                <w:sz w:val="18"/>
+              </w:rPr>
+              <w:t>Stage 2: Rectifier &amp; Bulk</w:t>
+            </w:r>
+          </w:p>
+        </w:tc>
+        <w:tc>
+          <w:tcPr>
+            <w:tcW w:type="dxa" w:w="3264"/>
+            <w:shd w:fill="F4F7F9"/>
+            <w:tcMar>
+              <w:top w:w="80" w:type="dxa"/>
+              <w:bottom w:w="80" w:type="dxa"/>
+              <w:left w:w="120" w:type="dxa"/>
+              <w:right w:w="120" w:type="dxa"/>
+            </w:tcMar>
+            <w:vAlign w:val="center"/>
+          </w:tcPr>
+          <w:p>
+            <w:pPr>
+              <w:spacing w:after="0"/>
+            </w:pPr>
+            <w:r>
+              <w:rPr>
+                <w:color w:val="282C34"/>
+                <w:sz w:val="18"/>
+              </w:rPr>
+              <w:t>&lt;img src="smart_programmable_power_supply/diagram_inside_stage2_rectifier.png" width="450"/&gt;</w:t>
+            </w:r>
+          </w:p>
+        </w:tc>
+        <w:tc>
+          <w:tcPr>
+            <w:tcW w:type="dxa" w:w="3264"/>
+            <w:shd w:fill="F4F7F9"/>
+            <w:tcMar>
+              <w:top w:w="80" w:type="dxa"/>
+              <w:bottom w:w="80" w:type="dxa"/>
+              <w:left w:w="120" w:type="dxa"/>
+              <w:right w:w="120" w:type="dxa"/>
+            </w:tcMar>
+            <w:vAlign w:val="center"/>
+          </w:tcPr>
+          <w:p>
+            <w:pPr>
+              <w:spacing w:after="0"/>
+            </w:pPr>
+            <w:r>
+              <w:rPr>
+                <w:color w:val="282C34"/>
+                <w:sz w:val="18"/>
+              </w:rPr>
+              <w:t>GBU606 bridge (600V, 6A), 100µF/450V bulk cap (&gt;10ms holdup), 100nF/630V HF cap, 3x 330kΩ bleeder.</w:t>
+            </w:r>
+          </w:p>
+        </w:tc>
+      </w:tr>
+      <w:tr>
+        <w:tc>
+          <w:tcPr>
+            <w:tcW w:type="dxa" w:w="3264"/>
+            <w:tcMar>
+              <w:top w:w="80" w:type="dxa"/>
+              <w:bottom w:w="80" w:type="dxa"/>
+              <w:left w:w="120" w:type="dxa"/>
+              <w:right w:w="120" w:type="dxa"/>
+            </w:tcMar>
+            <w:vAlign w:val="center"/>
+          </w:tcPr>
+          <w:p>
+            <w:pPr>
+              <w:spacing w:after="0"/>
+            </w:pPr>
+            <w:r>
+              <w:rPr>
+                <w:b/>
+                <w:color w:val="282C34"/>
+                <w:sz w:val="18"/>
+              </w:rPr>
+              <w:t>Stage 3: Converter DC-DC</w:t>
+            </w:r>
+          </w:p>
+        </w:tc>
+        <w:tc>
+          <w:tcPr>
+            <w:tcW w:type="dxa" w:w="3264"/>
+            <w:tcMar>
+              <w:top w:w="80" w:type="dxa"/>
+              <w:bottom w:w="80" w:type="dxa"/>
+              <w:left w:w="120" w:type="dxa"/>
+              <w:right w:w="120" w:type="dxa"/>
+            </w:tcMar>
+            <w:vAlign w:val="center"/>
+          </w:tcPr>
+          <w:p>
+            <w:pPr>
+              <w:spacing w:after="0"/>
+            </w:pPr>
+            <w:r>
+              <w:rPr>
+                <w:color w:val="282C34"/>
+                <w:sz w:val="18"/>
+              </w:rPr>
+              <w:t>&lt;img src="smart_programmable_power_supply/diagram_inside_stage3_flyback.png" width="450"/&gt;</w:t>
+            </w:r>
+          </w:p>
+        </w:tc>
+        <w:tc>
+          <w:tcPr>
+            <w:tcW w:type="dxa" w:w="3264"/>
+            <w:tcMar>
+              <w:top w:w="80" w:type="dxa"/>
+              <w:bottom w:w="80" w:type="dxa"/>
+              <w:left w:w="120" w:type="dxa"/>
+              <w:right w:w="120" w:type="dxa"/>
+            </w:tcMar>
+            <w:vAlign w:val="center"/>
+          </w:tcPr>
+          <w:p>
+            <w:pPr>
+              <w:spacing w:after="0"/>
+            </w:pPr>
+            <w:r>
+              <w:rPr>
+                <w:color w:val="282C34"/>
+                <w:sz w:val="18"/>
+              </w:rPr>
+              <w:t>TI UCC28740 QR Flyback, 800V CoolMOS, PQ26/20 core, 3000V RMS barrier, Sync Rectifier (BSC052N06NS) -&gt; +24V DC (72W).</w:t>
+            </w:r>
+          </w:p>
+        </w:tc>
+      </w:tr>
+      <w:tr>
+        <w:tc>
+          <w:tcPr>
+            <w:tcW w:type="dxa" w:w="3264"/>
+            <w:shd w:fill="F4F7F9"/>
+            <w:tcMar>
+              <w:top w:w="80" w:type="dxa"/>
+              <w:bottom w:w="80" w:type="dxa"/>
+              <w:left w:w="120" w:type="dxa"/>
+              <w:right w:w="120" w:type="dxa"/>
+            </w:tcMar>
+            <w:vAlign w:val="center"/>
+          </w:tcPr>
+          <w:p>
+            <w:pPr>
+              <w:spacing w:after="0"/>
+            </w:pPr>
+            <w:r>
+              <w:rPr>
+                <w:b/>
+                <w:color w:val="282C34"/>
+                <w:sz w:val="18"/>
+              </w:rPr>
+              <w:t>Stage 4: Final Stage</w:t>
+            </w:r>
+          </w:p>
+        </w:tc>
+        <w:tc>
+          <w:tcPr>
+            <w:tcW w:type="dxa" w:w="3264"/>
+            <w:shd w:fill="F4F7F9"/>
+            <w:tcMar>
+              <w:top w:w="80" w:type="dxa"/>
+              <w:bottom w:w="80" w:type="dxa"/>
+              <w:left w:w="120" w:type="dxa"/>
+              <w:right w:w="120" w:type="dxa"/>
+            </w:tcMar>
+            <w:vAlign w:val="center"/>
+          </w:tcPr>
+          <w:p>
+            <w:pPr>
+              <w:spacing w:after="0"/>
+            </w:pPr>
+            <w:r>
+              <w:rPr>
+                <w:color w:val="282C34"/>
+                <w:sz w:val="18"/>
+              </w:rPr>
+              <w:t>&lt;img src="smart_programmable_power_supply/diagram_inside_stage4_final_stage.png" width="450"/&gt;</w:t>
+            </w:r>
+          </w:p>
+        </w:tc>
+        <w:tc>
+          <w:tcPr>
+            <w:tcW w:type="dxa" w:w="3264"/>
+            <w:shd w:fill="F4F7F9"/>
+            <w:tcMar>
+              <w:top w:w="80" w:type="dxa"/>
+              <w:bottom w:w="80" w:type="dxa"/>
+              <w:left w:w="120" w:type="dxa"/>
+              <w:right w:w="120" w:type="dxa"/>
+            </w:tcMar>
+            <w:vAlign w:val="center"/>
+          </w:tcPr>
+          <w:p>
+            <w:pPr>
+              <w:spacing w:after="0"/>
+            </w:pPr>
+            <w:r>
+              <w:rPr>
+                <w:color w:val="282C34"/>
+                <w:sz w:val="18"/>
+              </w:rPr>
+              <w:t>TI LM5176 4-switch Buck-Boost, 10µH inductor, 10mV DAC steering (5V–20V), &lt; 5µs CC clamp, 4mm binding posts.</w:t>
+            </w:r>
+          </w:p>
+        </w:tc>
+      </w:tr>
+    </w:tbl>
+    <w:p/>
+    <w:p>
+      <w:pPr>
+        <w:pStyle w:val="ListBullet"/>
+        <w:spacing w:after="40"/>
+        <w:ind w:left="360"/>
+      </w:pPr>
+      <w:r>
+        <w:rPr>
+          <w:color w:val="282C34"/>
+          <w:sz w:val="21"/>
+        </w:rPr>
+        <w:t xml:space="preserve">📄 </w:t>
+      </w:r>
+      <w:r>
+        <w:rPr>
+          <w:b/>
+          <w:color w:val="282C34"/>
+          <w:sz w:val="21"/>
+        </w:rPr>
+        <w:t>Hardware PRD</w:t>
+      </w:r>
+      <w:r>
+        <w:rPr>
+          <w:color w:val="282C34"/>
+          <w:sz w:val="21"/>
+        </w:rPr>
+        <w:t xml:space="preserve">: </w:t>
+      </w:r>
+      <w:r>
+        <w:rPr>
+          <w:color w:val="0066CC"/>
+          <w:sz w:val="21"/>
+          <w:u w:val="single"/>
+        </w:rPr>
+        <w:t>PRODUCT_REQUIREMENT_DOCUMENT_PRD.md</w:t>
+      </w:r>
+    </w:p>
+    <w:p>
+      <w:pPr>
+        <w:pStyle w:val="ListBullet"/>
+        <w:spacing w:after="40"/>
+        <w:ind w:left="360"/>
+      </w:pPr>
+      <w:r>
+        <w:rPr>
+          <w:color w:val="282C34"/>
+          <w:sz w:val="21"/>
+        </w:rPr>
+        <w:t xml:space="preserve">📥 </w:t>
+      </w:r>
+      <w:r>
+        <w:rPr>
+          <w:b/>
+          <w:color w:val="282C34"/>
+          <w:sz w:val="21"/>
+        </w:rPr>
+        <w:t>Word Deliverables</w:t>
+      </w:r>
+      <w:r>
+        <w:rPr>
+          <w:color w:val="282C34"/>
+          <w:sz w:val="21"/>
+        </w:rPr>
+        <w:t xml:space="preserve">: </w:t>
+      </w:r>
+      <w:r>
+        <w:rPr>
+          <w:color w:val="0066CC"/>
+          <w:sz w:val="21"/>
+          <w:u w:val="single"/>
+        </w:rPr>
+        <w:t>PRODUCT_REQUIREMENT_DOCUMENT_PRD.docx</w:t>
+      </w:r>
+      <w:r>
+        <w:rPr>
+          <w:color w:val="282C34"/>
+          <w:sz w:val="21"/>
+        </w:rPr>
+        <w:t xml:space="preserve"> | </w:t>
+      </w:r>
+      <w:r>
+        <w:rPr>
+          <w:color w:val="0066CC"/>
+          <w:sz w:val="21"/>
+          <w:u w:val="single"/>
+        </w:rPr>
+        <w:t>PRD.docx</w:t>
+      </w:r>
+    </w:p>
+    <w:p>
+      <w:pPr>
+        <w:pStyle w:val="ListBullet"/>
+        <w:spacing w:after="40"/>
+        <w:ind w:left="360"/>
+      </w:pPr>
+      <w:r>
+        <w:rPr>
+          <w:color w:val="282C34"/>
+          <w:sz w:val="21"/>
+        </w:rPr>
+        <w:t xml:space="preserve">📂 </w:t>
+      </w:r>
+      <w:r>
+        <w:rPr>
+          <w:b/>
+          <w:color w:val="282C34"/>
+          <w:sz w:val="21"/>
+        </w:rPr>
+        <w:t>Full Hardware Architecture Dossiers</w:t>
+      </w:r>
+      <w:r>
+        <w:rPr>
+          <w:color w:val="282C34"/>
+          <w:sz w:val="21"/>
+        </w:rPr>
+        <w:t xml:space="preserve">: </w:t>
+      </w:r>
+      <w:r>
+        <w:rPr>
+          <w:color w:val="0066CC"/>
+          <w:sz w:val="21"/>
+          <w:u w:val="single"/>
+        </w:rPr>
+        <w:t>smart_programmable_power_supply/</w:t>
       </w:r>
     </w:p>
     <w:p>

</xml_diff>

<commit_message>
docs: streamline PRD to high-level requirements and extract deep circuit math to HDD technical reference
</commit_message>
<xml_diff>
--- a/README.docx
+++ b/README.docx
@@ -739,7 +739,7 @@
           <w:color w:val="282C34"/>
           <w:sz w:val="21"/>
         </w:rPr>
-        <w:t>Hardware PRD</w:t>
+        <w:t>Hardware PRD (High-Level Requirements)</w:t>
       </w:r>
       <w:r>
         <w:rPr>
@@ -755,6 +755,43 @@
           <w:u w:val="single"/>
         </w:rPr>
         <w:t>PRODUCT_REQUIREMENT_DOCUMENT_PRD.md</w:t>
+      </w:r>
+    </w:p>
+    <w:p>
+      <w:pPr>
+        <w:pStyle w:val="ListBullet"/>
+        <w:spacing w:after="40"/>
+        <w:ind w:left="360"/>
+      </w:pPr>
+      <w:r>
+        <w:rPr>
+          <w:color w:val="282C34"/>
+          <w:sz w:val="21"/>
+        </w:rPr>
+        <w:t xml:space="preserve">📐 </w:t>
+      </w:r>
+      <w:r>
+        <w:rPr>
+          <w:b/>
+          <w:color w:val="282C34"/>
+          <w:sz w:val="21"/>
+        </w:rPr>
+        <w:t>Hardware Design Document (HDD) Deep Technical Reference</w:t>
+      </w:r>
+      <w:r>
+        <w:rPr>
+          <w:color w:val="282C34"/>
+          <w:sz w:val="21"/>
+        </w:rPr>
+        <w:t xml:space="preserve">: </w:t>
+      </w:r>
+      <w:r>
+        <w:rPr>
+          <w:color w:val="0066CC"/>
+          <w:sz w:val="21"/>
+          <w:u w:val="single"/>
+        </w:rPr>
+        <w:t>HARDWARE_DESIGN_TECHNICAL_DETAILS_FOR_HDD.md</w:t>
       </w:r>
     </w:p>
     <w:p>

</xml_diff>